<commit_message>
docs(db-design): W04 conceptual ERD drawn in draw.io, inserted into write-up
- 과제_개념설계ERD.drawio: Crow's Foot(IE) ERD generated from the entity/relationship
  tables of the write-up (8 entities, 15 relationships, identifying vs non-identifying,
  M:N relationship attributes, legend)
- 과제_개념설계ERD.png: draw.io Desktop CLI export (scale 2)
- 과제_개념설계ERD_작성본.docx: section 6 placeholder replaced with the ERD image + caption
- .gitignore: ignore Word lock files (~$*.docx)

Co-Authored-By: Claude Fable 5.1 <noreply@anthropic.com>
</commit_message>
<xml_diff>
--- a/데이터 베이스 설계/과제_개념설계ERD_작성본.docx
+++ b/데이터 베이스 설계/과제_개념설계ERD_작성본.docx
@@ -9151,69 +9151,61 @@
     </w:p>
     <w:p>
       <w:pPr>
+        <w:jc w:val="center"/>
         <w:rPr>
           <w:lang w:eastAsia="ko-KR"/>
         </w:rPr>
       </w:pPr>
+      <w:r/>
       <w:r>
-        <w:rPr>
-          <w:b/>
-          <w:sz w:val="20"/>
-          <w:lang w:eastAsia="ko-KR"/>
-        </w:rPr>
-        <w:t xml:space="preserve">[ERD 삽입 영역 — 이미지 붙여넣기]</w:t>
+        <w:drawing>
+          <wp:inline xmlns:a="http://schemas.openxmlformats.org/drawingml/2006/main" xmlns:pic="http://schemas.openxmlformats.org/drawingml/2006/picture">
+            <wp:extent cx="5486400" cy="5593663"/>
+            <wp:docPr id="1" name="Picture 1"/>
+            <wp:cNvGraphicFramePr>
+              <a:graphicFrameLocks noChangeAspect="1"/>
+            </wp:cNvGraphicFramePr>
+            <a:graphic>
+              <a:graphicData uri="http://schemas.openxmlformats.org/drawingml/2006/picture">
+                <pic:pic>
+                  <pic:nvPicPr>
+                    <pic:cNvPr id="0" name="과제_개념설계ERD.png"/>
+                    <pic:cNvPicPr/>
+                  </pic:nvPicPr>
+                  <pic:blipFill>
+                    <a:blip r:embed="rId7"/>
+                    <a:stretch>
+                      <a:fillRect/>
+                    </a:stretch>
+                  </pic:blipFill>
+                  <pic:spPr>
+                    <a:xfrm>
+                      <a:off x="0" y="0"/>
+                      <a:ext cx="5486400" cy="5593663"/>
+                    </a:xfrm>
+                    <a:prstGeom prst="rect"/>
+                  </pic:spPr>
+                </pic:pic>
+              </a:graphicData>
+            </a:graphic>
+          </wp:inline>
+        </w:drawing>
       </w:r>
     </w:p>
     <w:p>
       <w:pPr>
+        <w:jc w:val="center"/>
         <w:rPr>
           <w:lang w:eastAsia="ko-KR"/>
         </w:rPr>
       </w:pPr>
+      <w:r/>
       <w:r>
         <w:rPr>
-          <w:lang w:eastAsia="ko-KR"/>
+          <w:rFonts w:ascii="맑은 고딕" w:hAnsi="맑은 고딕" w:eastAsia="맑은 고딕"/>
+          <w:sz w:val="18"/>
         </w:rPr>
-        <w:t>______________________________________________________________________</w:t>
-      </w:r>
-    </w:p>
-    <w:p>
-      <w:pPr>
-        <w:rPr>
-          <w:lang w:eastAsia="ko-KR"/>
-        </w:rPr>
-      </w:pPr>
-      <w:r>
-        <w:rPr>
-          <w:lang w:eastAsia="ko-KR"/>
-        </w:rPr>
-        <w:t>______________________________________________________________________</w:t>
-      </w:r>
-    </w:p>
-    <w:p>
-      <w:pPr>
-        <w:rPr>
-          <w:lang w:eastAsia="ko-KR"/>
-        </w:rPr>
-      </w:pPr>
-      <w:r>
-        <w:rPr>
-          <w:lang w:eastAsia="ko-KR"/>
-        </w:rPr>
-        <w:t>______________________________________________________________________</w:t>
-      </w:r>
-    </w:p>
-    <w:p>
-      <w:pPr>
-        <w:rPr>
-          <w:lang w:eastAsia="ko-KR"/>
-        </w:rPr>
-      </w:pPr>
-      <w:r>
-        <w:rPr>
-          <w:lang w:eastAsia="ko-KR"/>
-        </w:rPr>
-        <w:t>______________________________________________________________________</w:t>
+        <w:t>그림 1. 헬스 운동 볼륨 기록·분석 시스템 ERD (Crow's Foot/IE 표기, draw.io 32.4) — 엔티티 8개, 관계 15개. 원본 과제_개념설계ERD.drawio, 고해상도 이미지 과제_개념설계ERD.png 별도 첨부.</w:t>
       </w:r>
     </w:p>
     <w:p>

</xml_diff>